<commit_message>
Refactor figure generation and model evaluation process
- Updated `make_figures.py` to use out-of-fold predictions for threshold selection, improving the evaluation of model performance.
- Introduced `StratifiedKFold` and `cross_val_predict` for more robust threshold sweep calculations.
- Revised the main function's docstring to clarify the purpose of the report figures.
- Adjusted the decision threshold comment in `config.py` to reflect the change in methodology for threshold selection.
- Minor updates to plot titles for better clarity on the figures generated.
</commit_message>
<xml_diff>
--- a/output/docx/49.docx
+++ b/output/docx/49.docx
@@ -630,8 +630,9 @@
         </w:tblBorders>
       </w:tblPr>
       <w:tblGrid>
-        <w:gridCol w:w="3100"/>
-        <w:gridCol w:w="6260"/>
+        <w:gridCol w:w="2600"/>
+        <w:gridCol w:w="5260"/>
+        <w:gridCol w:w="1500"/>
       </w:tblGrid>
       <w:tr>
         <w:trPr>
@@ -640,7 +641,7 @@
         </w:trPr>
         <w:tc>
           <w:tcPr>
-            <w:tcW w:type="dxa" w:w="3100"/>
+            <w:tcW w:type="dxa" w:w="2600"/>
             <w:tcMar>
               <w:top w:w="80" w:type="dxa"/>
               <w:start w:w="120" w:type="dxa"/>
@@ -667,7 +668,7 @@
         </w:tc>
         <w:tc>
           <w:tcPr>
-            <w:tcW w:type="dxa" w:w="6260"/>
+            <w:tcW w:type="dxa" w:w="5260"/>
             <w:tcMar>
               <w:top w:w="80" w:type="dxa"/>
               <w:start w:w="120" w:type="dxa"/>
@@ -692,11 +693,38 @@
             </w:r>
           </w:p>
         </w:tc>
+        <w:tc>
+          <w:tcPr>
+            <w:tcW w:type="dxa" w:w="1500"/>
+            <w:tcMar>
+              <w:top w:w="80" w:type="dxa"/>
+              <w:start w:w="120" w:type="dxa"/>
+              <w:bottom w:w="80" w:type="dxa"/>
+              <w:end w:w="120" w:type="dxa"/>
+            </w:tcMar>
+            <w:vAlign w:val="center"/>
+            <w:shd w:fill="F2F4F7"/>
+          </w:tcPr>
+          <w:p>
+            <w:pPr>
+              <w:spacing w:after="0"/>
+            </w:pPr>
+            <w:r>
+              <w:rPr>
+                <w:rFonts w:ascii="Calibri" w:hAnsi="Calibri"/>
+                <w:b/>
+                <w:color w:val="0B2545"/>
+                <w:sz w:val="19"/>
+              </w:rPr>
+              <w:t>Location</w:t>
+            </w:r>
+          </w:p>
+        </w:tc>
       </w:tr>
       <w:tr>
         <w:tc>
           <w:tcPr>
-            <w:tcW w:type="dxa" w:w="3100"/>
+            <w:tcW w:type="dxa" w:w="2600"/>
           </w:tcPr>
           <w:p>
             <w:pPr>
@@ -714,7 +742,7 @@
         </w:tc>
         <w:tc>
           <w:tcPr>
-            <w:tcW w:type="dxa" w:w="6260"/>
+            <w:tcW w:type="dxa" w:w="5260"/>
           </w:tcPr>
           <w:p>
             <w:pPr>
@@ -730,11 +758,29 @@
             </w:r>
           </w:p>
         </w:tc>
+        <w:tc>
+          <w:tcPr>
+            <w:tcW w:type="dxa" w:w="1500"/>
+          </w:tcPr>
+          <w:p>
+            <w:pPr>
+              <w:spacing w:after="0" w:line="252" w:lineRule="auto"/>
+            </w:pPr>
+            <w:r>
+              <w:rPr>
+                <w:rFonts w:ascii="Calibri" w:hAnsi="Calibri"/>
+                <w:color w:val="202124"/>
+                <w:sz w:val="18"/>
+              </w:rPr>
+              <w:t>p. 5</w:t>
+            </w:r>
+          </w:p>
+        </w:tc>
       </w:tr>
       <w:tr>
         <w:tc>
           <w:tcPr>
-            <w:tcW w:type="dxa" w:w="3100"/>
+            <w:tcW w:type="dxa" w:w="2600"/>
           </w:tcPr>
           <w:p>
             <w:pPr>
@@ -752,7 +798,7 @@
         </w:tc>
         <w:tc>
           <w:tcPr>
-            <w:tcW w:type="dxa" w:w="6260"/>
+            <w:tcW w:type="dxa" w:w="5260"/>
           </w:tcPr>
           <w:p>
             <w:pPr>
@@ -768,11 +814,29 @@
             </w:r>
           </w:p>
         </w:tc>
+        <w:tc>
+          <w:tcPr>
+            <w:tcW w:type="dxa" w:w="1500"/>
+          </w:tcPr>
+          <w:p>
+            <w:pPr>
+              <w:spacing w:after="0" w:line="252" w:lineRule="auto"/>
+            </w:pPr>
+            <w:r>
+              <w:rPr>
+                <w:rFonts w:ascii="Calibri" w:hAnsi="Calibri"/>
+                <w:color w:val="202124"/>
+                <w:sz w:val="18"/>
+              </w:rPr>
+              <w:t>p. 6</w:t>
+            </w:r>
+          </w:p>
+        </w:tc>
       </w:tr>
       <w:tr>
         <w:tc>
           <w:tcPr>
-            <w:tcW w:type="dxa" w:w="3100"/>
+            <w:tcW w:type="dxa" w:w="2600"/>
           </w:tcPr>
           <w:p>
             <w:pPr>
@@ -790,7 +854,7 @@
         </w:tc>
         <w:tc>
           <w:tcPr>
-            <w:tcW w:type="dxa" w:w="6260"/>
+            <w:tcW w:type="dxa" w:w="5260"/>
           </w:tcPr>
           <w:p>
             <w:pPr>
@@ -806,11 +870,29 @@
             </w:r>
           </w:p>
         </w:tc>
+        <w:tc>
+          <w:tcPr>
+            <w:tcW w:type="dxa" w:w="1500"/>
+          </w:tcPr>
+          <w:p>
+            <w:pPr>
+              <w:spacing w:after="0" w:line="252" w:lineRule="auto"/>
+            </w:pPr>
+            <w:r>
+              <w:rPr>
+                <w:rFonts w:ascii="Calibri" w:hAnsi="Calibri"/>
+                <w:color w:val="202124"/>
+                <w:sz w:val="18"/>
+              </w:rPr>
+              <w:t>pp. 7-8</w:t>
+            </w:r>
+          </w:p>
+        </w:tc>
       </w:tr>
       <w:tr>
         <w:tc>
           <w:tcPr>
-            <w:tcW w:type="dxa" w:w="3100"/>
+            <w:tcW w:type="dxa" w:w="2600"/>
           </w:tcPr>
           <w:p>
             <w:pPr>
@@ -828,7 +910,7 @@
         </w:tc>
         <w:tc>
           <w:tcPr>
-            <w:tcW w:type="dxa" w:w="6260"/>
+            <w:tcW w:type="dxa" w:w="5260"/>
           </w:tcPr>
           <w:p>
             <w:pPr>
@@ -844,11 +926,29 @@
             </w:r>
           </w:p>
         </w:tc>
+        <w:tc>
+          <w:tcPr>
+            <w:tcW w:type="dxa" w:w="1500"/>
+          </w:tcPr>
+          <w:p>
+            <w:pPr>
+              <w:spacing w:after="0" w:line="252" w:lineRule="auto"/>
+            </w:pPr>
+            <w:r>
+              <w:rPr>
+                <w:rFonts w:ascii="Calibri" w:hAnsi="Calibri"/>
+                <w:color w:val="202124"/>
+                <w:sz w:val="18"/>
+              </w:rPr>
+              <w:t>p. 9</w:t>
+            </w:r>
+          </w:p>
+        </w:tc>
       </w:tr>
       <w:tr>
         <w:tc>
           <w:tcPr>
-            <w:tcW w:type="dxa" w:w="3100"/>
+            <w:tcW w:type="dxa" w:w="2600"/>
           </w:tcPr>
           <w:p>
             <w:pPr>
@@ -866,7 +966,7 @@
         </w:tc>
         <w:tc>
           <w:tcPr>
-            <w:tcW w:type="dxa" w:w="6260"/>
+            <w:tcW w:type="dxa" w:w="5260"/>
           </w:tcPr>
           <w:p>
             <w:pPr>
@@ -878,7 +978,25 @@
                 <w:color w:val="202124"/>
                 <w:sz w:val="18"/>
               </w:rPr>
-              <w:t>Four versioned or operational endpoints with OpenAPI documentation</w:t>
+              <w:t>Four endpoints with OpenAPI documentation</w:t>
+            </w:r>
+          </w:p>
+        </w:tc>
+        <w:tc>
+          <w:tcPr>
+            <w:tcW w:type="dxa" w:w="1500"/>
+          </w:tcPr>
+          <w:p>
+            <w:pPr>
+              <w:spacing w:after="0" w:line="252" w:lineRule="auto"/>
+            </w:pPr>
+            <w:r>
+              <w:rPr>
+                <w:rFonts w:ascii="Calibri" w:hAnsi="Calibri"/>
+                <w:color w:val="202124"/>
+                <w:sz w:val="18"/>
+              </w:rPr>
+              <w:t>pp. 10-11</w:t>
             </w:r>
           </w:p>
         </w:tc>
@@ -886,7 +1004,7 @@
       <w:tr>
         <w:tc>
           <w:tcPr>
-            <w:tcW w:type="dxa" w:w="3100"/>
+            <w:tcW w:type="dxa" w:w="2600"/>
           </w:tcPr>
           <w:p>
             <w:pPr>
@@ -904,7 +1022,7 @@
         </w:tc>
         <w:tc>
           <w:tcPr>
-            <w:tcW w:type="dxa" w:w="6260"/>
+            <w:tcW w:type="dxa" w:w="5260"/>
           </w:tcPr>
           <w:p>
             <w:pPr>
@@ -920,11 +1038,29 @@
             </w:r>
           </w:p>
         </w:tc>
+        <w:tc>
+          <w:tcPr>
+            <w:tcW w:type="dxa" w:w="1500"/>
+          </w:tcPr>
+          <w:p>
+            <w:pPr>
+              <w:spacing w:after="0" w:line="252" w:lineRule="auto"/>
+            </w:pPr>
+            <w:r>
+              <w:rPr>
+                <w:rFonts w:ascii="Calibri" w:hAnsi="Calibri"/>
+                <w:color w:val="202124"/>
+                <w:sz w:val="18"/>
+              </w:rPr>
+              <w:t>p. 12</w:t>
+            </w:r>
+          </w:p>
+        </w:tc>
       </w:tr>
       <w:tr>
         <w:tc>
           <w:tcPr>
-            <w:tcW w:type="dxa" w:w="3100"/>
+            <w:tcW w:type="dxa" w:w="2600"/>
           </w:tcPr>
           <w:p>
             <w:pPr>
@@ -942,7 +1078,7 @@
         </w:tc>
         <w:tc>
           <w:tcPr>
-            <w:tcW w:type="dxa" w:w="6260"/>
+            <w:tcW w:type="dxa" w:w="5260"/>
           </w:tcPr>
           <w:p>
             <w:pPr>
@@ -958,11 +1094,29 @@
             </w:r>
           </w:p>
         </w:tc>
+        <w:tc>
+          <w:tcPr>
+            <w:tcW w:type="dxa" w:w="1500"/>
+          </w:tcPr>
+          <w:p>
+            <w:pPr>
+              <w:spacing w:after="0" w:line="252" w:lineRule="auto"/>
+            </w:pPr>
+            <w:r>
+              <w:rPr>
+                <w:rFonts w:ascii="Calibri" w:hAnsi="Calibri"/>
+                <w:color w:val="202124"/>
+                <w:sz w:val="18"/>
+              </w:rPr>
+              <w:t>pp. 13-14</w:t>
+            </w:r>
+          </w:p>
+        </w:tc>
       </w:tr>
       <w:tr>
         <w:tc>
           <w:tcPr>
-            <w:tcW w:type="dxa" w:w="3100"/>
+            <w:tcW w:type="dxa" w:w="2600"/>
           </w:tcPr>
           <w:p>
             <w:pPr>
@@ -980,7 +1134,7 @@
         </w:tc>
         <w:tc>
           <w:tcPr>
-            <w:tcW w:type="dxa" w:w="6260"/>
+            <w:tcW w:type="dxa" w:w="5260"/>
           </w:tcPr>
           <w:p>
             <w:pPr>
@@ -992,7 +1146,25 @@
                 <w:color w:val="202124"/>
                 <w:sz w:val="18"/>
               </w:rPr>
-              <w:t>Six model metrics, missingness, schema, ranges, and PSI</w:t>
+              <w:t>Model metrics, missingness, schema, ranges, and PSI</w:t>
+            </w:r>
+          </w:p>
+        </w:tc>
+        <w:tc>
+          <w:tcPr>
+            <w:tcW w:type="dxa" w:w="1500"/>
+          </w:tcPr>
+          <w:p>
+            <w:pPr>
+              <w:spacing w:after="0" w:line="252" w:lineRule="auto"/>
+            </w:pPr>
+            <w:r>
+              <w:rPr>
+                <w:rFonts w:ascii="Calibri" w:hAnsi="Calibri"/>
+                <w:color w:val="202124"/>
+                <w:sz w:val="18"/>
+              </w:rPr>
+              <w:t>pp. 15-20</w:t>
             </w:r>
           </w:p>
         </w:tc>
@@ -1000,7 +1172,7 @@
       <w:tr>
         <w:tc>
           <w:tcPr>
-            <w:tcW w:type="dxa" w:w="3100"/>
+            <w:tcW w:type="dxa" w:w="2600"/>
           </w:tcPr>
           <w:p>
             <w:pPr>
@@ -1018,7 +1190,7 @@
         </w:tc>
         <w:tc>
           <w:tcPr>
-            <w:tcW w:type="dxa" w:w="6260"/>
+            <w:tcW w:type="dxa" w:w="5260"/>
           </w:tcPr>
           <w:p>
             <w:pPr>
@@ -1030,7 +1202,25 @@
                 <w:color w:val="202124"/>
                 <w:sz w:val="18"/>
               </w:rPr>
-              <w:t>Shadow/canary/A-B plan plus request and access controls</w:t>
+              <w:t>Shadow/canary/A-B plan plus boundary controls</w:t>
+            </w:r>
+          </w:p>
+        </w:tc>
+        <w:tc>
+          <w:tcPr>
+            <w:tcW w:type="dxa" w:w="1500"/>
+          </w:tcPr>
+          <w:p>
+            <w:pPr>
+              <w:spacing w:after="0" w:line="252" w:lineRule="auto"/>
+            </w:pPr>
+            <w:r>
+              <w:rPr>
+                <w:rFonts w:ascii="Calibri" w:hAnsi="Calibri"/>
+                <w:color w:val="202124"/>
+                <w:sz w:val="18"/>
+              </w:rPr>
+              <w:t>p. 21</w:t>
             </w:r>
           </w:p>
         </w:tc>
@@ -6630,7 +6820,7 @@
           <w:color w:val="5F6368"/>
           <w:sz w:val="18"/>
         </w:rPr>
-        <w:t>Actual signal test - tests/test_model_training.py</w:t>
+        <w:t>Capacity-test excerpt - tests/test_model_training.py</w:t>
       </w:r>
     </w:p>
     <w:p>
@@ -6648,7 +6838,7 @@
           <w:color w:val="202124"/>
           <w:sz w:val="16"/>
         </w:rPr>
-        <w:t>mean_auc = float(np.mean(shuffled_aucs))</w:t>
+        <w:t>losses = []</w:t>
         <w:br/>
       </w:r>
       <w:r>
@@ -6657,7 +6847,7 @@
           <w:color w:val="202124"/>
           <w:sz w:val="16"/>
         </w:rPr>
-        <w:t>real_auc = roc_auc_score(</w:t>
+        <w:t>for n_estimators in (1, 5, 25, 100):</w:t>
         <w:br/>
       </w:r>
       <w:r>
@@ -6666,7 +6856,7 @@
           <w:color w:val="202124"/>
           <w:sz w:val="16"/>
         </w:rPr>
-        <w:t xml:space="preserve">    split.y_test,</w:t>
+        <w:t xml:space="preserve">    ...</w:t>
         <w:br/>
       </w:r>
       <w:r>
@@ -6675,7 +6865,7 @@
           <w:color w:val="202124"/>
           <w:sz w:val="16"/>
         </w:rPr>
-        <w:t xml:space="preserve">    trained_pipeline.predict_proba(split.x_test)[:, 1],</w:t>
+        <w:t xml:space="preserve">    pipeline.fit(split.x_train, split.y_train)</w:t>
         <w:br/>
       </w:r>
       <w:r>
@@ -6684,7 +6874,7 @@
           <w:color w:val="202124"/>
           <w:sz w:val="16"/>
         </w:rPr>
-        <w:t>)</w:t>
+        <w:t xml:space="preserve">    probabilities = pipeline.predict_proba(split.x_train)[:, 1]</w:t>
         <w:br/>
       </w:r>
       <w:r>
@@ -6693,7 +6883,7 @@
           <w:color w:val="202124"/>
           <w:sz w:val="16"/>
         </w:rPr>
-        <w:t>assert abs(mean_auc - 0.5) &lt; 0.12</w:t>
+        <w:t xml:space="preserve">    losses.append(log_loss(</w:t>
         <w:br/>
       </w:r>
       <w:r>
@@ -6702,7 +6892,34 @@
           <w:color w:val="202124"/>
           <w:sz w:val="16"/>
         </w:rPr>
-        <w:t>assert real_auc - mean_auc &gt; 0.20</w:t>
+        <w:t xml:space="preserve">        split.y_train, probabilities, labels=[0, 1]</w:t>
+        <w:br/>
+      </w:r>
+      <w:r>
+        <w:rPr>
+          <w:rFonts w:ascii="Courier New" w:hAnsi="Courier New"/>
+          <w:color w:val="202124"/>
+          <w:sz w:val="16"/>
+        </w:rPr>
+        <w:t xml:space="preserve">    ))</w:t>
+        <w:br/>
+      </w:r>
+      <w:r>
+        <w:rPr>
+          <w:rFonts w:ascii="Courier New" w:hAnsi="Courier New"/>
+          <w:color w:val="202124"/>
+          <w:sz w:val="16"/>
+        </w:rPr>
+        <w:t>assert losses[-1] &lt; losses[0]</w:t>
+        <w:br/>
+      </w:r>
+      <w:r>
+        <w:rPr>
+          <w:rFonts w:ascii="Courier New" w:hAnsi="Courier New"/>
+          <w:color w:val="202124"/>
+          <w:sz w:val="16"/>
+        </w:rPr>
+        <w:t>assert losses == sorted(losses, reverse=True)</w:t>
       </w:r>
     </w:p>
     <w:p>
@@ -6712,7 +6929,7 @@
           <w:color w:val="202124"/>
           <w:sz w:val="22"/>
         </w:rPr>
-        <w:t>The overfit test is a diagnostic, not a production objective. On only 60 rows, a flexible forest should be able to fit the labels. If it cannot, the data may not be reaching the classifier correctly. The shuffled-label test checks a different risk: a real model should clearly beat data where the relationship between features and churn has been destroyed.</w:t>
+        <w:t>The overfit test is a diagnostic, not a production objective. On only 60 rows, a flexible forest should be able to fit the labels. In the capacity check, training log loss fell from 4.433369 to 0.150294, 0.130241, and 0.128518 as the forest increased from 1 to 5, 25, and 100 trees. The separate shuffled-label test checks that the real model clearly beats data where the feature-target relationship has been destroyed.</w:t>
       </w:r>
     </w:p>
     <w:p>
@@ -7809,7 +8026,7 @@
           <w:color w:val="5F6368"/>
           <w:sz w:val="17"/>
         </w:rPr>
-        <w:t>Figure 7. Holdout confusion matrix at 0.35 (left) and precision-recall-F1 threshold sweep (right).</w:t>
+        <w:t>Figure 7. Holdout confusion matrix at 0.35 (left) and training-only OOF threshold sweep (right).</w:t>
       </w:r>
     </w:p>
     <w:tbl>
@@ -7990,7 +8207,7 @@
                 <w:color w:val="202124"/>
                 <w:sz w:val="18"/>
               </w:rPr>
-              <w:t>0.30</w:t>
+              <w:t>0.31</w:t>
             </w:r>
           </w:p>
         </w:tc>
@@ -8008,7 +8225,7 @@
                 <w:color w:val="202124"/>
                 <w:sz w:val="18"/>
               </w:rPr>
-              <w:t>0.5072</w:t>
+              <w:t>0.5091</w:t>
             </w:r>
           </w:p>
         </w:tc>
@@ -8026,7 +8243,7 @@
                 <w:color w:val="202124"/>
                 <w:sz w:val="18"/>
               </w:rPr>
-              <w:t>0.6629</w:t>
+              <w:t>0.6585</w:t>
             </w:r>
           </w:p>
         </w:tc>
@@ -8044,7 +8261,7 @@
                 <w:color w:val="202124"/>
                 <w:sz w:val="18"/>
               </w:rPr>
-              <w:t>0.5747</w:t>
+              <w:t>0.5742</w:t>
             </w:r>
           </w:p>
         </w:tc>
@@ -8062,7 +8279,7 @@
                 <w:color w:val="202124"/>
                 <w:sz w:val="18"/>
               </w:rPr>
-              <w:t>Best observed F1; more customers contacted</w:t>
+              <w:t>Best training OOF F1; more customers contacted</w:t>
             </w:r>
           </w:p>
         </w:tc>
@@ -8100,7 +8317,7 @@
                 <w:color w:val="202124"/>
                 <w:sz w:val="18"/>
               </w:rPr>
-              <w:t>0.5439</w:t>
+              <w:t>0.5381</w:t>
             </w:r>
           </w:p>
         </w:tc>
@@ -8118,7 +8335,7 @@
                 <w:color w:val="202124"/>
                 <w:sz w:val="18"/>
               </w:rPr>
-              <w:t>0.5805</w:t>
+              <w:t>0.5901</w:t>
             </w:r>
           </w:p>
         </w:tc>
@@ -8136,7 +8353,7 @@
                 <w:color w:val="202124"/>
                 <w:sz w:val="18"/>
               </w:rPr>
-              <w:t>0.5616</w:t>
+              <w:t>0.5629</w:t>
             </w:r>
           </w:p>
         </w:tc>
@@ -8154,7 +8371,7 @@
                 <w:color w:val="202124"/>
                 <w:sz w:val="18"/>
               </w:rPr>
-              <w:t>Deployed setting; fewer false alerts</w:t>
+              <w:t>Configured setting; higher precision</w:t>
             </w:r>
           </w:p>
         </w:tc>
@@ -8172,7 +8389,7 @@
           <w:color w:val="202124"/>
           <w:sz w:val="22"/>
         </w:rPr>
-        <w:t>The mathematical F1 maximum on this holdout is near 0.30. We retained 0.35 because it raises precision and reduces unnecessary outreach, while still clearing the F1 gate. This is a reasonable demonstration choice, but it is not a final commercial decision. A production threshold should use the cost of an offer, the value of retaining a customer, and the capacity of the retention team.</w:t>
+        <w:t>The sweep uses five-fold out-of-fold predictions from the 4,000 training records, so the 1,000-record final holdout remains untouched. F1 is highest at 0.31. We retained 0.35 because it improves precision while keeping training OOF F1 close to the maximum. The final holdout metrics are then reported once at 0.35. A commercial threshold should also include offer cost, retained value, and retention-team capacity.</w:t>
       </w:r>
     </w:p>
     <w:p>
@@ -8187,7 +8404,7 @@
           <w:color w:val="5F6368"/>
           <w:sz w:val="18"/>
         </w:rPr>
-        <w:t>Actual threshold logic - src/churnguard/models/evaluation.py</w:t>
+        <w:t>Actual OOF sweep - scripts/make_figures.py</w:t>
       </w:r>
     </w:p>
     <w:p>
@@ -8205,7 +8422,7 @@
           <w:color w:val="202124"/>
           <w:sz w:val="16"/>
         </w:rPr>
-        <w:t>threshold = SETTINGS.model.decision_threshold</w:t>
+        <w:t>threshold_cv = StratifiedKFold(</w:t>
         <w:br/>
       </w:r>
       <w:r>
@@ -8214,7 +8431,7 @@
           <w:color w:val="202124"/>
           <w:sz w:val="16"/>
         </w:rPr>
-        <w:t>y_pred = (y_prob &gt;= threshold).astype(int)</w:t>
+        <w:t xml:space="preserve">    n_splits=5, shuffle=True, random_state=42</w:t>
         <w:br/>
       </w:r>
       <w:r>
@@ -8223,7 +8440,7 @@
           <w:color w:val="202124"/>
           <w:sz w:val="16"/>
         </w:rPr>
-        <w:t>metrics = ModelMetrics(</w:t>
+        <w:t>)</w:t>
         <w:br/>
       </w:r>
       <w:r>
@@ -8232,7 +8449,7 @@
           <w:color w:val="202124"/>
           <w:sz w:val="16"/>
         </w:rPr>
-        <w:t xml:space="preserve">    precision=float(precision_score(y_true, y_pred,</w:t>
+        <w:t>oof_probabilities = cross_val_predict(</w:t>
         <w:br/>
       </w:r>
       <w:r>
@@ -8241,7 +8458,7 @@
           <w:color w:val="202124"/>
           <w:sz w:val="16"/>
         </w:rPr>
-        <w:t xml:space="preserve">                                    zero_division=0)),</w:t>
+        <w:t xml:space="preserve">    ChurnModelTrainer().build_pipeline(),</w:t>
         <w:br/>
       </w:r>
       <w:r>
@@ -8250,7 +8467,7 @@
           <w:color w:val="202124"/>
           <w:sz w:val="16"/>
         </w:rPr>
-        <w:t xml:space="preserve">    recall=float(recall_score(y_true, y_pred,</w:t>
+        <w:t xml:space="preserve">    split.x_train,</w:t>
         <w:br/>
       </w:r>
       <w:r>
@@ -8259,7 +8476,7 @@
           <w:color w:val="202124"/>
           <w:sz w:val="16"/>
         </w:rPr>
-        <w:t xml:space="preserve">                              zero_division=0)),</w:t>
+        <w:t xml:space="preserve">    split.y_train,</w:t>
         <w:br/>
       </w:r>
       <w:r>
@@ -8268,7 +8485,7 @@
           <w:color w:val="202124"/>
           <w:sz w:val="16"/>
         </w:rPr>
-        <w:t xml:space="preserve">    f1=float(f1_score(y_true, y_pred, zero_division=0)),</w:t>
+        <w:t xml:space="preserve">    cv=threshold_cv,</w:t>
         <w:br/>
       </w:r>
       <w:r>
@@ -8277,7 +8494,43 @@
           <w:color w:val="202124"/>
           <w:sz w:val="16"/>
         </w:rPr>
-        <w:t xml:space="preserve">    confusion=confusion_matrix(y_true, y_pred).tolist(),</w:t>
+        <w:t xml:space="preserve">    method="predict_proba",</w:t>
+        <w:br/>
+      </w:r>
+      <w:r>
+        <w:rPr>
+          <w:rFonts w:ascii="Courier New" w:hAnsi="Courier New"/>
+          <w:color w:val="202124"/>
+          <w:sz w:val="16"/>
+        </w:rPr>
+        <w:t xml:space="preserve">    n_jobs=1,</w:t>
+        <w:br/>
+      </w:r>
+      <w:r>
+        <w:rPr>
+          <w:rFonts w:ascii="Courier New" w:hAnsi="Courier New"/>
+          <w:color w:val="202124"/>
+          <w:sz w:val="16"/>
+        </w:rPr>
+        <w:t>)[:, 1]</w:t>
+        <w:br/>
+      </w:r>
+      <w:r>
+        <w:rPr>
+          <w:rFonts w:ascii="Courier New" w:hAnsi="Courier New"/>
+          <w:color w:val="202124"/>
+          <w:sz w:val="16"/>
+        </w:rPr>
+        <w:t>sweep = _threshold_sweep(</w:t>
+        <w:br/>
+      </w:r>
+      <w:r>
+        <w:rPr>
+          <w:rFonts w:ascii="Courier New" w:hAnsi="Courier New"/>
+          <w:color w:val="202124"/>
+          <w:sz w:val="16"/>
+        </w:rPr>
+        <w:t xml:space="preserve">    split.y_train.to_numpy(), oof_probabilities</w:t>
         <w:br/>
       </w:r>
       <w:r>
@@ -9267,7 +9520,7 @@
           <w:color w:val="202124"/>
           <w:sz w:val="22"/>
         </w:rPr>
-        <w:t>The current holdout is stable, as expected from the deterministic split. To prove that the check can detect a real change, we also reduced the tenure distribution in a copy of the data. Stable traffic produced PSI 0.0118, while the deliberately shifted sample produced 7.7190 and would fail the 0.20 gate. The extreme value is intentional: it makes the failure behaviour easy to verify.</w:t>
+        <w:t>The stored maximum PSI of 0.0005 comes from the standard validation run against the saved reference profile. The separate plotted detector demonstration compares training tenure with holdout tenure, producing PSI 0.0118. Reducing tenure in a copy of the data raises PSI to 7.7190 and fails the 0.20 gate. The large shift is intentional because it makes the failure behaviour easy to verify.</w:t>
       </w:r>
     </w:p>
     <w:p>
@@ -11114,7 +11367,7 @@
           <w:color w:val="202124"/>
           <w:sz w:val="21"/>
         </w:rPr>
-        <w:t>The threshold was examined on the holdout set. A stronger study would reserve another validation set for threshold selection and keep the final test set untouched.</w:t>
+        <w:t>The threshold uses training-only out-of-fold predictions, but its final business value still needs validation against campaign cost, capacity, and retention outcomes.</w:t>
       </w:r>
     </w:p>
     <w:p>
@@ -11685,6 +11938,34 @@
     </w:p>
     <w:p>
       <w:pPr>
+        <w:keepLines/>
+        <w:spacing w:before="80" w:after="140"/>
+        <w:ind w:left="115" w:right="72"/>
+        <w:shd w:fill="EAF2F8"/>
+        <w:pBdr>
+          <w:left w:val="single" w:sz="12" w:space="5" w:color="2E74B5"/>
+        </w:pBdr>
+      </w:pPr>
+      <w:r>
+        <w:rPr>
+          <w:rFonts w:ascii="Calibri" w:hAnsi="Calibri"/>
+          <w:b/>
+          <w:color w:val="0B2545"/>
+          <w:sz w:val="20"/>
+        </w:rPr>
+        <w:t xml:space="preserve">Reproducibility snapshot: </w:t>
+      </w:r>
+      <w:r>
+        <w:rPr>
+          <w:rFonts w:ascii="Calibri" w:hAnsi="Calibri"/>
+          <w:color w:val="202124"/>
+          <w:sz w:val="20"/>
+        </w:rPr>
+        <w:t>Python 3.11.15 | Git HEAD at verification: 18ad2e47ef5b1ca3a78654cfa5dea14c5e59176e | Dependencies locked in uv.lock</w:t>
+      </w:r>
+    </w:p>
+    <w:p>
+      <w:pPr>
         <w:pStyle w:val="Heading2"/>
         <w:keepNext/>
       </w:pPr>
@@ -12000,7 +12281,7 @@
                 <w:color w:val="202124"/>
                 <w:sz w:val="18"/>
               </w:rPr>
-              <w:t>Regenerate all evaluation figures from the holdout set</w:t>
+              <w:t>Regenerate holdout plots and the training-only OOF threshold sweep</w:t>
             </w:r>
           </w:p>
         </w:tc>
@@ -12232,7 +12513,7 @@
                 <w:color w:val="0B2545"/>
                 <w:sz w:val="19"/>
               </w:rPr>
-              <w:t>Contribution</w:t>
+              <w:t>%</w:t>
             </w:r>
           </w:p>
         </w:tc>

</xml_diff>